<commit_message>
El conversor a Word es menjava els subapartats
md2docx nomes tractava ## com a encapcalament; els ### quedaven com a
paragraf normal. Al correu a l Adria aixo afectava els tres subapartats
de la seccio dels IDs, que son on hi ha la regla dels clients nous i la
correccio del new_code: es perdia justament l estructura de la part que
mes se li demana que llegeixi.

Co-Authored-By: Claude Opus 5 (1M context) <noreply@anthropic.com>
</commit_message>
<xml_diff>
--- a/resposta_adria_1.docx
+++ b/resposta_adria_1.docx
@@ -271,17 +271,14 @@
       </w:r>
     </w:p>
     <w:p>
-      <w:r>
-        <w:rPr>
-          <w:b/>
-        </w:rPr>
-        <w:t>El que sí que necessitem de tu</w:t>
-      </w:r>
+      <w:pPr>
+        <w:pStyle w:val="Heading3"/>
+      </w:pPr>
       <w:r>
         <w:rPr>
           <w:b w:val="0"/>
         </w:rPr>
-        <w:t xml:space="preserve"> és la correspondència per poder omplir el camp dels clients: passa'ns la llista dels vostres codis de client amb el nom. El CIF el tenim a SAP i creuem nosaltres. Sense això hauríem d'anar només per nom, que és on surten els casos dubtosos.</w:t>
+        <w:t>I els clients nous?</w:t>
       </w:r>
     </w:p>
     <w:p>
@@ -289,7 +286,199 @@
         <w:rPr>
           <w:b w:val="0"/>
         </w:rPr>
-        <w:t xml:space="preserve">I una cosa que t'agrairé confirmar: </w:t>
+        <w:t xml:space="preserve">La regla és: </w:t>
+      </w:r>
+      <w:r>
+        <w:rPr>
+          <w:b/>
+        </w:rPr>
+        <w:t>si té codi de KAIS, us enviem el de KAIS; si no en té, el de SAP.</w:t>
+      </w:r>
+    </w:p>
+    <w:p>
+      <w:r>
+        <w:rPr>
+          <w:b w:val="0"/>
+        </w:rPr>
+        <w:t>Un client donat d'alta a SAP després del tall no ha existit mai a KAIS, així que us arribarà amb el seu codi de SAP (</w:t>
+      </w:r>
+      <w:r>
+        <w:rPr>
+          <w:rFonts w:ascii="Consolas" w:hAnsi="Consolas"/>
+          <w:b w:val="0"/>
+          <w:color w:val="333333"/>
+          <w:sz w:val="20"/>
+        </w:rPr>
+        <w:t>C001024-000</w:t>
+      </w:r>
+      <w:r>
+        <w:rPr>
+          <w:b w:val="0"/>
+        </w:rPr>
+        <w:t>) i el conservarà per sempre. Per vosaltres és el comportament correcte: és un client nou de debò i ha d'aparèixer com a tal.</w:t>
+      </w:r>
+    </w:p>
+    <w:p>
+      <w:r>
+        <w:rPr>
+          <w:b w:val="0"/>
+        </w:rPr>
+        <w:t>Això vol dir que a la llista hi conviuran els dos formats —</w:t>
+      </w:r>
+      <w:r>
+        <w:rPr>
+          <w:rFonts w:ascii="Consolas" w:hAnsi="Consolas"/>
+          <w:b w:val="0"/>
+          <w:color w:val="333333"/>
+          <w:sz w:val="20"/>
+        </w:rPr>
+        <w:t>00001066-000</w:t>
+      </w:r>
+      <w:r>
+        <w:rPr>
+          <w:b w:val="0"/>
+        </w:rPr>
+        <w:t xml:space="preserve"> dels que venen de KAIS i </w:t>
+      </w:r>
+      <w:r>
+        <w:rPr>
+          <w:rFonts w:ascii="Consolas" w:hAnsi="Consolas"/>
+          <w:b w:val="0"/>
+          <w:color w:val="333333"/>
+          <w:sz w:val="20"/>
+        </w:rPr>
+        <w:t>C001024-000</w:t>
+      </w:r>
+      <w:r>
+        <w:rPr>
+          <w:b w:val="0"/>
+        </w:rPr>
+        <w:t xml:space="preserve"> dels nous—, però no es poden trepitjar: els vostres són vuit dígits i els de SAP són una </w:t>
+      </w:r>
+      <w:r>
+        <w:rPr>
+          <w:rFonts w:ascii="Consolas" w:hAnsi="Consolas"/>
+          <w:b w:val="0"/>
+          <w:color w:val="333333"/>
+          <w:sz w:val="20"/>
+        </w:rPr>
+        <w:t>C</w:t>
+      </w:r>
+      <w:r>
+        <w:rPr>
+          <w:b w:val="0"/>
+        </w:rPr>
+        <w:t xml:space="preserve"> i sis. Cap dels dos deixa de ser únic ni canvia mai.</w:t>
+      </w:r>
+    </w:p>
+    <w:p>
+      <w:r>
+        <w:rPr>
+          <w:b w:val="0"/>
+        </w:rPr>
+        <w:t>El mateix criteri per als comercials i les famílies.</w:t>
+      </w:r>
+    </w:p>
+    <w:p>
+      <w:pPr>
+        <w:pStyle w:val="Heading3"/>
+      </w:pPr>
+      <w:r>
+        <w:rPr>
+          <w:b w:val="0"/>
+        </w:rPr>
+        <w:t xml:space="preserve">El </w:t>
+      </w:r>
+      <w:r>
+        <w:rPr>
+          <w:rFonts w:ascii="Consolas" w:hAnsi="Consolas"/>
+          <w:b w:val="0"/>
+          <w:color w:val="333333"/>
+          <w:sz w:val="20"/>
+        </w:rPr>
+        <w:t>new_code</w:t>
+      </w:r>
+    </w:p>
+    <w:p>
+      <w:r>
+        <w:rPr>
+          <w:b w:val="0"/>
+        </w:rPr>
+        <w:t xml:space="preserve">Amb això, el </w:t>
+      </w:r>
+      <w:r>
+        <w:rPr>
+          <w:rFonts w:ascii="Consolas" w:hAnsi="Consolas"/>
+          <w:b w:val="0"/>
+          <w:color w:val="333333"/>
+          <w:sz w:val="20"/>
+        </w:rPr>
+        <w:t>new_code</w:t>
+      </w:r>
+      <w:r>
+        <w:rPr>
+          <w:b w:val="0"/>
+        </w:rPr>
+        <w:t xml:space="preserve"> queda més net del que et vaig plantejar. Ja no fa de pont cap a KAIS —el pont és el propi identificador—, així que </w:t>
+      </w:r>
+      <w:r>
+        <w:rPr>
+          <w:b/>
+        </w:rPr>
+        <w:t>només portarà l'identificador del successor</w:t>
+      </w:r>
+      <w:r>
+        <w:rPr>
+          <w:b w:val="0"/>
+        </w:rPr>
+        <w:t xml:space="preserve"> quan un client canviï de raó social: es desactiva un, se n'obre un altre, i el registre vell us diu quin és el nou. Igual que ara. La resta del temps anirà buit.</w:t>
+      </w:r>
+    </w:p>
+    <w:p>
+      <w:r>
+        <w:rPr>
+          <w:b w:val="0"/>
+        </w:rPr>
+        <w:t>Ho omplim nosaltres a cada canvi. I com que això depèn que algú se'n recordi, hi afegim una xarxa: si detectem un client nou amb el mateix NIF que un de desactivat, us l'enllacem igualment.</w:t>
+      </w:r>
+    </w:p>
+    <w:p>
+      <w:pPr>
+        <w:pStyle w:val="Heading3"/>
+      </w:pPr>
+      <w:r>
+        <w:rPr>
+          <w:b w:val="0"/>
+        </w:rPr>
+        <w:t>El que necessito de tu</w:t>
+      </w:r>
+    </w:p>
+    <w:p>
+      <w:r>
+        <w:rPr>
+          <w:b w:val="0"/>
+        </w:rPr>
+        <w:t xml:space="preserve">La correspondència per poder omplir el camp dels clients: </w:t>
+      </w:r>
+      <w:r>
+        <w:rPr>
+          <w:b/>
+        </w:rPr>
+        <w:t>passa'm la llista dels vostres codis de client amb el nom</w:t>
+      </w:r>
+      <w:r>
+        <w:rPr>
+          <w:b w:val="0"/>
+        </w:rPr>
+        <w:t>. El CIF el tenim a SAP i creuem nosaltres. Sense això hauríem d'anar només per nom, que és on surten els casos dubtosos.</w:t>
+      </w:r>
+    </w:p>
+    <w:p>
+      <w:r>
+        <w:rPr>
+          <w:b w:val="0"/>
+        </w:rPr>
+        <w:t xml:space="preserve">I </w:t>
       </w:r>
       <w:r>
         <w:rPr>
@@ -301,7 +490,7 @@
         <w:rPr>
           <w:b w:val="0"/>
         </w:rPr>
-        <w:t>. Els que tenim tenen pinta de ser els vostres, però prefereixo comprovar-ho que no pas suposar-ho.</w:t>
+        <w:t>, per confirmar que els que tenim són els vostres. Prefereixo comprovar-ho que no pas suposar-ho.</w:t>
       </w:r>
     </w:p>
     <w:p>

</xml_diff>